<commit_message>
docs: libera fluxo de contribuicao da equipe
</commit_message>
<xml_diff>
--- a/docs/Guia_Colaboracao_Codex_Ilha_dos_Conjuntos.docx
+++ b/docs/Guia_Colaboracao_Codex_Ilha_dos_Conjuntos.docx
@@ -886,7 +886,7 @@
         <w:pStyle w:val="Heading1"/>
       </w:pPr>
       <w:r>
-        <w:t>5. Permissões e proteção da main</w:t>
+        <w:t>5. Permissões e liberdade de colaboração</w:t>
       </w:r>
     </w:p>
     <w:p>
@@ -967,7 +967,7 @@
           <w:color w:val="000000"/>
           <w:sz w:val="22"/>
         </w:rPr>
-        <w:t>Quem possui Write pode criar branches, enviar commits e abrir Pull Requests. A main foi protegida com as seguintes regras:</w:t>
+        <w:t>Quem possui Write pode criar branches, enviar commits, fazer merge e trabalhar diretamente na main. A equipe optou por manter a branch liberada e coordenar o trabalho por comunicação diária.</w:t>
       </w:r>
     </w:p>
     <w:p>
@@ -986,7 +986,7 @@
           <w:color w:val="000000"/>
           <w:sz w:val="22"/>
         </w:rPr>
-        <w:t>Toda contribuição comum deve entrar por Pull Request.</w:t>
+        <w:t>Commits diretos na main são permitidos para todos os colaboradores com Write.</w:t>
       </w:r>
     </w:p>
     <w:p>
@@ -1005,7 +1005,7 @@
           <w:color w:val="000000"/>
           <w:sz w:val="22"/>
         </w:rPr>
-        <w:t>O Pull Request precisa de uma aprovação de outro integrante.</w:t>
+        <w:t>Branches e Pull Requests são opcionais e podem ser usados em mudanças maiores.</w:t>
       </w:r>
     </w:p>
     <w:p>
@@ -1024,7 +1024,7 @@
           <w:color w:val="000000"/>
           <w:sz w:val="22"/>
         </w:rPr>
-        <w:t>Se o autor enviar um novo commit, a aprovação anterior deixa de valer.</w:t>
+        <w:t>Cada integrante combina com a equipe qual parte será alterada antes de começar.</w:t>
       </w:r>
     </w:p>
     <w:p>
@@ -1043,7 +1043,7 @@
           <w:color w:val="000000"/>
           <w:sz w:val="22"/>
         </w:rPr>
-        <w:t>A pessoa que fez o último push não pode aprovar esse mesmo estado do Pull Request.</w:t>
+        <w:t>Revisões podem ser solicitadas informalmente quando ajudarem a reduzir riscos.</w:t>
       </w:r>
     </w:p>
     <w:p>
@@ -1062,7 +1062,7 @@
           <w:color w:val="000000"/>
           <w:sz w:val="22"/>
         </w:rPr>
-        <w:t>Todas as conversas de revisão precisam ser resolvidas.</w:t>
+        <w:t>Antes de enviar, execute npm run build e confira os arquivos alterados.</w:t>
       </w:r>
     </w:p>
     <w:p>
@@ -1081,7 +1081,7 @@
           <w:color w:val="000000"/>
           <w:sz w:val="22"/>
         </w:rPr>
-        <w:t>Force-push e exclusão da main estão bloqueados.</w:t>
+        <w:t>Evite force-push e exclusões desnecessárias, mesmo sem bloqueio técnico.</w:t>
       </w:r>
     </w:p>
     <w:p>
@@ -1101,7 +1101,7 @@
           <w:color w:val="173F3D"/>
           <w:sz w:val="22"/>
         </w:rPr>
-        <w:t xml:space="preserve">Exceção administrativa: </w:t>
+        <w:t xml:space="preserve">Acordo da equipe: </w:t>
       </w:r>
       <w:r>
         <w:rPr>
@@ -1111,7 +1111,7 @@
           <w:color w:val="173F3D"/>
           <w:sz w:val="22"/>
         </w:rPr>
-        <w:t>A proteção não é aplicada ao administrador do repositório. Use essa exceção somente para emergências; no trabalho normal, Vitor também deve usar Pull Request.</w:t>
+        <w:t>A liberdade de acesso é sustentada pela comunicação diária. Para mudanças extensas, avise quais arquivos serão trabalhados e combine uma revisão somente quando fizer sentido.</w:t>
       </w:r>
     </w:p>
     <w:p>
@@ -1119,7 +1119,7 @@
         <w:pStyle w:val="Heading1"/>
       </w:pPr>
       <w:r>
-        <w:t>6. Fluxo obrigatório de contribuição</w:t>
+        <w:t>6. Fluxo recomendado de contribuição</w:t>
       </w:r>
     </w:p>
     <w:p>
@@ -1157,7 +1157,7 @@
           <w:color w:val="000000"/>
           <w:sz w:val="22"/>
         </w:rPr>
-        <w:t>Criar uma branch com nome relacionado à tarefa.</w:t>
+        <w:t>Escolher trabalho direto na main ou uma branch, conforme combinado com a equipe.</w:t>
       </w:r>
     </w:p>
     <w:p>
@@ -1233,7 +1233,7 @@
           <w:color w:val="000000"/>
           <w:sz w:val="22"/>
         </w:rPr>
-        <w:t>Enviar a branch para o GitHub.</w:t>
+        <w:t>Enviar os commits para o GitHub.</w:t>
       </w:r>
     </w:p>
     <w:p>
@@ -1252,7 +1252,7 @@
           <w:color w:val="000000"/>
           <w:sz w:val="22"/>
         </w:rPr>
-        <w:t>Abrir Pull Request para a main e pedir revisão de outro integrante.</w:t>
+        <w:t>Usar Pull Request quando uma mudança maior se beneficiar de revisão.</w:t>
       </w:r>
     </w:p>
     <w:p>
@@ -1271,7 +1271,7 @@
           <w:color w:val="000000"/>
           <w:sz w:val="22"/>
         </w:rPr>
-        <w:t>Corrigir os comentários, obter uma aprovação e fazer o merge.</w:t>
+        <w:t>Avisar a equipe sobre a entrega para evitar conflitos de trabalho.</w:t>
       </w:r>
     </w:p>
     <w:p>
@@ -1345,27 +1345,9 @@
         </w:rPr>
         <w:t>git checkout main</w:t>
         <w:br/>
-      </w:r>
-      <w:r>
-        <w:rPr>
-          <w:rFonts w:ascii="Consolas" w:hAnsi="Consolas"/>
-          <w:b w:val="0"/>
-          <w:i w:val="0"/>
-          <w:color w:val="173F3D"/>
-          <w:sz w:val="19"/>
-        </w:rPr>
         <w:t>git pull origin main</w:t>
         <w:br/>
-      </w:r>
-      <w:r>
-        <w:rPr>
-          <w:rFonts w:ascii="Consolas" w:hAnsi="Consolas"/>
-          <w:b w:val="0"/>
-          <w:i w:val="0"/>
-          <w:color w:val="173F3D"/>
-          <w:sz w:val="19"/>
-        </w:rPr>
-        <w:t>git checkout -b feature/nome-da-tarefa</w:t>
+        <w:t># opcional: git checkout -b feature/nome-da-tarefa</w:t>
       </w:r>
     </w:p>
     <w:p>
@@ -1458,7 +1440,7 @@
           <w:color w:val="000000"/>
           <w:sz w:val="22"/>
         </w:rPr>
-        <w:t>Depois do push, abrir um Pull Request no GitHub. Nunca usar git push --force e nunca trabalhar diretamente na main.</w:t>
+        <w:t>Depois do commit, envie para a main ou para uma branch, conforme o combinado da equipe. Evite git push --force.</w:t>
       </w:r>
     </w:p>
     <w:p>
@@ -1642,7 +1624,7 @@
           <w:color w:val="000000"/>
           <w:sz w:val="22"/>
         </w:rPr>
-        <w:t>O workflow Publicar no GitHub Pages é acionado somente por push ou merge na branch main. Commits em branches de trabalho ficam registrados, mas não mudam o jogo público.</w:t>
+        <w:t>O workflow Publicar no GitHub Pages é acionado por qualquer push direto ou merge na branch main. Commits em outras branches ficam registrados, mas não mudam o jogo público.</w:t>
       </w:r>
     </w:p>
     <w:p>
@@ -1659,7 +1641,7 @@
           <w:color w:val="173F3D"/>
           <w:sz w:val="19"/>
         </w:rPr>
-        <w:t>branch de trabalho -&gt; Pull Request -&gt; aprovação -&gt; merge na main -&gt; GitHub Pages</w:t>
+        <w:t>push direto na main OU merge de branch -&gt; GitHub Pages</w:t>
       </w:r>
     </w:p>
     <w:p>
@@ -1710,49 +1692,13 @@
         </w:rPr>
         <w:t>Trabalhe no projeto Ilha dos Conjuntos seguindo AGENTS.md, README.md,</w:t>
         <w:br/>
-      </w:r>
-      <w:r>
-        <w:rPr>
-          <w:rFonts w:ascii="Consolas" w:hAnsi="Consolas"/>
-          <w:b w:val="0"/>
-          <w:i w:val="0"/>
-          <w:color w:val="173F3D"/>
-          <w:sz w:val="19"/>
-        </w:rPr>
-        <w:t>CONTRIBUTING.md e o guia anexado. Antes de editar, atualize a main e crie</w:t>
+        <w:t>CONTRIBUTING.md e o guia anexado. Antes de editar, atualize a main e</w:t>
         <w:br/>
-      </w:r>
-      <w:r>
-        <w:rPr>
-          <w:rFonts w:ascii="Consolas" w:hAnsi="Consolas"/>
-          <w:b w:val="0"/>
-          <w:i w:val="0"/>
-          <w:color w:val="173F3D"/>
-          <w:sz w:val="19"/>
-        </w:rPr>
-        <w:t>uma branch adequada. Preserve acessibilidade, linguagem do 5º ano e</w:t>
+        <w:t>combine a tarefa com a equipe. Você pode trabalhar diretamente na main ou</w:t>
         <w:br/>
-      </w:r>
-      <w:r>
-        <w:rPr>
-          <w:rFonts w:ascii="Consolas" w:hAnsi="Consolas"/>
-          <w:b w:val="0"/>
-          <w:i w:val="0"/>
-          <w:color w:val="173F3D"/>
-          <w:sz w:val="19"/>
-        </w:rPr>
-        <w:t>feedback educativo. Execute npm run build, faça commits pequenos e abra</w:t>
+        <w:t>usar uma branch. Preserve acessibilidade e linguagem do 5º ano. Execute</w:t>
         <w:br/>
-      </w:r>
-      <w:r>
-        <w:rPr>
-          <w:rFonts w:ascii="Consolas" w:hAnsi="Consolas"/>
-          <w:b w:val="0"/>
-          <w:i w:val="0"/>
-          <w:color w:val="173F3D"/>
-          <w:sz w:val="19"/>
-        </w:rPr>
-        <w:t>um Pull Request; não envie mudanças diretamente para a main.</w:t>
+        <w:t>npm run build e faça commits pequenos e descritivos.</w:t>
       </w:r>
     </w:p>
     <w:p>
@@ -1836,7 +1782,7 @@
           <w:color w:val="000000"/>
           <w:sz w:val="22"/>
         </w:rPr>
-        <w:t>Se o Codex deve apenas analisar ou também implementar, testar, commitar e abrir Pull Request.</w:t>
+        <w:t>Se o Codex deve apenas analisar ou também implementar, testar, commitar e enviar a alteração.</w:t>
       </w:r>
     </w:p>
     <w:p>
@@ -1996,7 +1942,7 @@
           <w:color w:val="000000"/>
           <w:sz w:val="22"/>
         </w:rPr>
-        <w:t>npm run build termina sem erros antes do Pull Request.</w:t>
+        <w:t>npm run build termina sem erros antes de enviar as alterações.</w:t>
       </w:r>
     </w:p>
     <w:p>
@@ -2126,7 +2072,7 @@
         <w:pStyle w:val="Heading1"/>
       </w:pPr>
       <w:r>
-        <w:t>12. Checklist antes do Pull Request</w:t>
+        <w:t>12. Checklist antes de enviar alterações</w:t>
       </w:r>
     </w:p>
     <w:p>
@@ -2145,7 +2091,7 @@
           <w:color w:val="000000"/>
           <w:sz w:val="22"/>
         </w:rPr>
-        <w:t>A branch tem nome claro e foi criada a partir da main atualizada.</w:t>
+        <w:t>A main local está atualizada e a tarefa foi combinada com a equipe.</w:t>
       </w:r>
     </w:p>
     <w:p>
@@ -2278,7 +2224,7 @@
           <w:color w:val="000000"/>
           <w:sz w:val="22"/>
         </w:rPr>
-        <w:t>Outro integrante foi indicado para revisar o Pull Request.</w:t>
+        <w:t>A equipe foi informada sobre a entrega e os arquivos alterados.</w:t>
       </w:r>
     </w:p>
     <w:sectPr>

</xml_diff>